<commit_message>
fix(astrologie-karmique): corrige la leçon 03 et durcit le prompt du job
Leçon 03 :
- titre original de Schulman (Karmic Astrology, Vol. 1, Samuel Weiser
  1975), le titre cité n'existait pas ;
- éditeur français : Éditions Hélios 1985, non Ariane ;
- 4 sources Wikipédia du Régime A remplacées par NASA/GSFC et IMCCE
  (URLs testées, statut 200) ;
- fausse précision retirée : « environ 18,6 ans » et « environ
  19,35°/an », la NASA et l'IMCCE divergeant de ~4 jours sur le cycle ;
- deux coquilles.
Corrections fondues dans le texte, formulations d'origine conservées
dans un journal des corrections en fin de document.

jobs_config.json — Régime A : liste fermée de sources institutionnelles,
Wikipédia explicitement exclue comme source citable, et règle de
précision affichée (pas plus de décimales que les sources n'en
garantissent conjointement). launchd resynchronisé (13 agents).

Co-Authored-By: Claude Opus 5 <noreply@anthropic.com>
</commit_message>
<xml_diff>
--- a/livrables/lecons/2026-08-20_lecon-astrologie-karmique_03_noeuds-lunaires-astronomie-corpus.docx
+++ b/livrables/lecons/2026-08-20_lecon-astrologie-karmique_03_noeuds-lunaires-astronomie-corpus.docx
@@ -483,25 +483,25 @@
           <w:sz w:val="22"/>
           <w:szCs w:val="22"/>
         </w:rPr>
-        <w:t xml:space="preserve">La particularité décisive : ce mouvement est rétrograde. La ligne des nœuds tourne à rebours du mouvement des planètes (à rebours du sens ouest-est), à raison de 19,3549° par an vers l'ouest.</w:t>
-      </w:r>
-    </w:p>
-    <w:p>
-      <w:pPr>
-        <w:spacing w:after="60" w:before="60"/>
-      </w:pPr>
-      <w:r>
-        <w:rPr>
-          <w:rFonts w:ascii="Times New Roman" w:cs="Times New Roman" w:eastAsia="Times New Roman" w:hAnsi="Times New Roman"/>
-          <w:b w:val="false"/>
-          <w:bCs w:val="false"/>
-          <w:i w:val="false"/>
-          <w:iCs w:val="false"/>
-          <w:color w:val="1F2937"/>
-          <w:sz w:val="22"/>
-          <w:szCs w:val="22"/>
-        </w:rPr>
-        <w:t xml:space="preserve">Période complète de ce cycle : 18,5996 ans — arrondi à 18,6 ans dans la littérature astrologique. Cela signifie que les nœuds lunaires parcourent l'intégralité du zodiaque en 18,6 ans (rétrogrades), soit environ 18 à 19 mois par signe.</w:t>
+        <w:t xml:space="preserve">La particularité décisive : ce mouvement est rétrograde. La ligne des nœuds tourne à rebours du mouvement des planètes (à rebours du sens ouest-est), à raison d'environ 19,35° par an vers l'ouest.</w:t>
+      </w:r>
+    </w:p>
+    <w:p>
+      <w:pPr>
+        <w:spacing w:after="60" w:before="60"/>
+      </w:pPr>
+      <w:r>
+        <w:rPr>
+          <w:rFonts w:ascii="Times New Roman" w:cs="Times New Roman" w:eastAsia="Times New Roman" w:hAnsi="Times New Roman"/>
+          <w:b w:val="false"/>
+          <w:bCs w:val="false"/>
+          <w:i w:val="false"/>
+          <w:iCs w:val="false"/>
+          <w:color w:val="1F2937"/>
+          <w:sz w:val="22"/>
+          <w:szCs w:val="22"/>
+        </w:rPr>
+        <w:t xml:space="preserve">Période complète de ce cycle : environ 18,6 ans. La NASA donne 6 793,48 jours, l'IMCCE 18,61 années tropiques : deux sources de référence qui ne concordent pas au-delà de la deuxième décimale. Il n'y a donc pas lieu d'afficher davantage de précision. Cela signifie que les nœuds lunaires parcourent l'intégralité du zodiaque en 18,6 ans (rétrogrades), soit environ 18 à 19 mois par signe.</w:t>
       </w:r>
     </w:p>
     <w:tbl>
@@ -837,7 +837,7 @@
           <w:sz w:val="22"/>
           <w:szCs w:val="22"/>
         </w:rPr>
-        <w:t xml:space="preserve">Martin Schulman publie en 1975 le premier volume de son « Astrologie karmique » sous le titre Karma and Reincarnation through the Horoscope. La traduction française paraît chez Ariane Éditions sous le titre Astrologie karmique, vol. I : Les Nœuds de la Lune et la réincarnation (ISBN 978-2880630003).</w:t>
+        <w:t xml:space="preserve">Martin Schulman publie en 1975 le premier volume de son « Astrologie karmique » sous le titre Karmic Astrology, Volume 1 : The Moon's Nodes and Reincarnation (Samuel Weiser, ISBN 0-87728-288-9). La traduction française paraît en 1985 aux Éditions Hélios sous le titre Astrologie karmique, vol. I : Les Nœuds de la Lune et la réincarnation (ISBN 978-2880630003).</w:t>
       </w:r>
     </w:p>
     <w:p>
@@ -1829,7 +1829,7 @@
                 <w:sz w:val="20"/>
                 <w:szCs w:val="20"/>
               </w:rPr>
-              <w:t xml:space="preserve">L'orbite lunaire est inclinée de 5,145° sur le plan de l'écliptique. Les nœuds sont les deux intersections de ces plans. (Wikipedia, Orbite de la Lune)</w:t>
+              <w:t xml:space="preserve">L'orbite lunaire est inclinée de 5,145° sur le plan de l'écliptique. Les nœuds sont les deux intersections de ces plans. (NASA, Eclipses and the Moon's Orbit)</w:t>
             </w:r>
           </w:p>
         </w:tc>
@@ -1897,7 +1897,7 @@
                 <w:sz w:val="20"/>
                 <w:szCs w:val="20"/>
               </w:rPr>
-              <w:t xml:space="preserve">Les nœuds sont toujours en opposition exacte (180°) : nécessité géométrique. (Wikipedia, Orbite de la Lune)</w:t>
+              <w:t xml:space="preserve">Les nœuds sont toujours en opposition exacte (180°) : nécessité géométrique. (NASA, Eclipses and the Moon's Orbit)</w:t>
             </w:r>
           </w:p>
         </w:tc>
@@ -1965,7 +1965,7 @@
                 <w:sz w:val="20"/>
                 <w:szCs w:val="20"/>
               </w:rPr>
-              <w:t xml:space="preserve">La ligne des nœuds est rétrograde : elle tourne à rebours du mouvement planétaire, à 19,3549°/an, cycle de 18,6 ans. (Wikipedia, Orbite de la Lune ; Obspm.fr)</w:t>
+              <w:t xml:space="preserve">La ligne des nœuds est rétrograde : elle tourne à rebours du mouvement planétaire, à environ 19,35°/an, cycle d'environ 18,6 ans. (NASA, Eclipses and the Moon's Orbit ; IMCCE)</w:t>
             </w:r>
           </w:p>
         </w:tc>
@@ -2101,7 +2101,7 @@
                 <w:sz w:val="20"/>
                 <w:szCs w:val="20"/>
               </w:rPr>
-              <w:t xml:space="preserve">Les nœuds ne sont pas des corps célestes : pas de masse, pas de lumière propre. Ce sont des points mathématiques. (Wikipedia, Orbite de la Lune)</w:t>
+              <w:t xml:space="preserve">Les nœuds ne sont pas des corps célestes : pas de masse, pas de lumière propre. Ce sont des points mathématiques. (NASA, Eclipses and the Moon's Orbit)</w:t>
             </w:r>
           </w:p>
         </w:tc>
@@ -2500,7 +2500,7 @@
           <w:sz w:val="22"/>
           <w:szCs w:val="22"/>
         </w:rPr>
-        <w:t xml:space="preserve">Dans quel secteur (maison) du thème tombe le Nœud Nord ? La maison indique le domaine de vie concerné (travail, famille, partenariat, créativité…). Les leçons 06 déploiera cela.</w:t>
+        <w:t xml:space="preserve">Dans quel secteur (maison) du thème tombe le Nœud Nord ? La maison indique le domaine de vie concerné (travail, famille, partenariat, créativité…). La leçon 06 déploiera cela.</w:t>
       </w:r>
     </w:p>
     <w:p>
@@ -2605,7 +2605,7 @@
           <w:sz w:val="22"/>
           <w:szCs w:val="22"/>
         </w:rPr>
-        <w:t xml:space="preserve">Note ta première réaction à cette lecture : elle résonite-t-elle ? Ou pas du tout ? Cette question sur la résonance personnelle est au cœur de ce que les leçons 04 et 05 exploreront.</w:t>
+        <w:t xml:space="preserve">Note ta première réaction à cette lecture : résonne-t-elle ? Ou pas du tout ? Cette question sur la résonance personnelle est au cœur de ce que les leçons 04 et 05 exploreront.</w:t>
       </w:r>
     </w:p>
     <w:p>
@@ -2891,7 +2891,7 @@
           <w:sz w:val="22"/>
           <w:szCs w:val="22"/>
         </w:rPr>
-        <w:t xml:space="preserve">Orbite de la Lune (inclinaison 5,145°, nœuds, cycle 18,6 ans, mois draconitique) : </w:t>
+        <w:t xml:space="preserve">Orbite lunaire — inclinaison 5,145°, nœuds, cycle de 18,6 ans, mois draconitique et sidéral : </w:t>
       </w:r>
       <w:hyperlink w:history="1" r:id="rIdxf8e17pikzptfqhxvybh6">
         <w:r>
@@ -2902,7 +2902,7 @@
             <w:szCs w:val="22"/>
             <w:u w:val="single"/>
           </w:rPr>
-          <w:t xml:space="preserve">Wikipédia — Orbite de la Lune</w:t>
+          <w:t xml:space="preserve">NASA / GSFC — Eclipses and the Moon's Orbit</w:t>
         </w:r>
       </w:hyperlink>
     </w:p>
@@ -2953,7 +2953,7 @@
           <w:sz w:val="22"/>
           <w:szCs w:val="22"/>
         </w:rPr>
-        <w:t xml:space="preserve">Mois draconitique — définition et calcul : </w:t>
+        <w:t xml:space="preserve">Révolution draconitique et période de la ligne des nœuds : </w:t>
       </w:r>
       <w:hyperlink w:history="1" r:id="rIdfiwaozwit3b0imex4vwnz">
         <w:r>
@@ -2964,7 +2964,7 @@
             <w:szCs w:val="22"/>
             <w:u w:val="single"/>
           </w:rPr>
-          <w:t xml:space="preserve">Wikipédia — Mois draconitique</w:t>
+          <w:t xml:space="preserve">IMCCE — Concepts fondamentaux : les éclipses de Lune</w:t>
         </w:r>
       </w:hyperlink>
     </w:p>
@@ -2984,7 +2984,7 @@
           <w:sz w:val="22"/>
           <w:szCs w:val="22"/>
         </w:rPr>
-        <w:t xml:space="preserve">Éclipse solaire — conditions, rôle des nœuds, angle limite : </w:t>
+        <w:t xml:space="preserve">Éclipses de Soleil — dossier de référence (sommaire et chapitres) : </w:t>
       </w:r>
       <w:hyperlink w:history="1" r:id="rIdsgpauomweuwnugzwtp-rq">
         <w:r>
@@ -2995,7 +2995,7 @@
             <w:szCs w:val="22"/>
             <w:u w:val="single"/>
           </w:rPr>
-          <w:t xml:space="preserve">Wikipédia — Éclipse solaire</w:t>
+          <w:t xml:space="preserve">IMCCE — Concepts fondamentaux : les éclipses de Soleil</w:t>
         </w:r>
       </w:hyperlink>
     </w:p>
@@ -3015,20 +3015,8 @@
           <w:sz w:val="22"/>
           <w:szCs w:val="22"/>
         </w:rPr>
-        <w:t xml:space="preserve">Éclipse lunaire — conditions géométriques, saisons d'éclipses : </w:t>
-      </w:r>
-      <w:hyperlink w:history="1" r:id="rIdzmjigvreq0qhsjblqustl">
-        <w:r>
-          <w:rPr>
-            <w:rFonts w:ascii="Times New Roman" w:cs="Times New Roman" w:eastAsia="Times New Roman" w:hAnsi="Times New Roman"/>
-            <w:color w:val="1155CC"/>
-            <w:sz w:val="22"/>
-            <w:szCs w:val="22"/>
-            <w:u w:val="single"/>
-          </w:rPr>
-          <w:t xml:space="preserve">Wikipédia — Éclipse lunaire</w:t>
-        </w:r>
-      </w:hyperlink>
+        <w:t xml:space="preserve">Écart entre sources sur la période des nœuds : la NASA donne 6 793,48 jours pour un tour complet de la ligne des nœuds, l'IMCCE 18,61 années tropiques (6 797,16 jours). Environ quatre jours séparent deux sources de référence — « environ 18,6 ans » est la valeur à retenir, sans décimales supplémentaires.</w:t>
+      </w:r>
     </w:p>
     <w:p>
       <w:pPr>
@@ -3081,7 +3069,7 @@
           <w:sz w:val="22"/>
           <w:szCs w:val="22"/>
         </w:rPr>
-        <w:t xml:space="preserve">Martin Schulman — Astrologie karmique, vol. I : Les Nœuds de la Lune et la réincarnation (ISBN 978-2880630003). Cité sans lien direct vers l'ouvrage (pages librairie testées, résultats variables selon retailer).</w:t>
+        <w:t xml:space="preserve">Martin Schulman — Astrologie karmique, vol. I : Les Nœuds de la Lune et la réincarnation (Éditions Hélios, 1985, ISBN 978-2880630003) ; original : Karmic Astrology, Volume 1 : The Moon's Nodes and Reincarnation (Samuel Weiser, 1975, ISBN 0-87728-288-9). Cité sans lien direct vers l'ouvrage (pages librairie testées, résultats variables selon retailer).</w:t>
       </w:r>
     </w:p>
     <w:p>
@@ -3223,6 +3211,215 @@
         </w:tc>
       </w:tr>
     </w:tbl>
+    <w:p>
+      <w:pPr>
+        <w:pStyle w:val="Heading2"/>
+        <w:spacing w:after="80" w:before="280"/>
+      </w:pPr>
+      <w:r>
+        <w:rPr>
+          <w:rFonts w:ascii="Times New Roman" w:cs="Times New Roman" w:eastAsia="Times New Roman" w:hAnsi="Times New Roman"/>
+          <w:b/>
+          <w:bCs/>
+          <w:color w:val="1B3A6B"/>
+          <w:sz w:val="30"/>
+          <w:szCs w:val="30"/>
+        </w:rPr>
+        <w:t xml:space="preserve">📝 Journal des corrections</w:t>
+      </w:r>
+    </w:p>
+    <w:p>
+      <w:pPr>
+        <w:spacing w:after="60" w:before="60"/>
+      </w:pPr>
+      <w:r>
+        <w:rPr>
+          <w:rFonts w:ascii="Times New Roman" w:cs="Times New Roman" w:eastAsia="Times New Roman" w:hAnsi="Times New Roman"/>
+          <w:b w:val="false"/>
+          <w:bCs w:val="false"/>
+          <w:color w:val="1F2937"/>
+          <w:sz w:val="22"/>
+          <w:szCs w:val="22"/>
+        </w:rPr>
+        <w:t xml:space="preserve">Leçon produite et relue le 20/08/2026. Les corrections sont fondues dans le texte ci-dessus ; la formulation d'origine est conservée ici.</w:t>
+      </w:r>
+    </w:p>
+    <w:p>
+      <w:pPr>
+        <w:spacing w:after="60" w:before="60"/>
+      </w:pPr>
+      <w:r>
+        <w:rPr>
+          <w:rFonts w:ascii="Times New Roman" w:cs="Times New Roman" w:eastAsia="Times New Roman" w:hAnsi="Times New Roman"/>
+          <w:b w:val="false"/>
+          <w:bCs w:val="false"/>
+          <w:color w:val="1F2937"/>
+          <w:sz w:val="22"/>
+          <w:szCs w:val="22"/>
+        </w:rPr>
+        <w:t xml:space="preserve">1. Titre original de l'ouvrage de Schulman.</w:t>
+      </w:r>
+    </w:p>
+    <w:p>
+      <w:pPr>
+        <w:spacing w:after="60" w:before="60"/>
+      </w:pPr>
+      <w:r>
+        <w:rPr>
+          <w:rFonts w:ascii="Times New Roman" w:cs="Times New Roman" w:eastAsia="Times New Roman" w:hAnsi="Times New Roman"/>
+          <w:b w:val="false"/>
+          <w:bCs w:val="false"/>
+          <w:color w:val="1F2937"/>
+          <w:sz w:val="22"/>
+          <w:szCs w:val="22"/>
+        </w:rPr>
+        <w:t xml:space="preserve">Version initiale : « sous le titre Karma and Reincarnation through the Horoscope ». Ce titre n'existe pas. L'ouvrage de 1975 s'intitule Karmic Astrology, Volume 1 : The Moon's Nodes and Reincarnation (Samuel Weiser, ISBN 0-87728-288-9).</w:t>
+      </w:r>
+    </w:p>
+    <w:p>
+      <w:pPr>
+        <w:spacing w:after="60" w:before="60"/>
+      </w:pPr>
+      <w:r>
+        <w:rPr>
+          <w:rFonts w:ascii="Times New Roman" w:cs="Times New Roman" w:eastAsia="Times New Roman" w:hAnsi="Times New Roman"/>
+          <w:b w:val="false"/>
+          <w:bCs w:val="false"/>
+          <w:color w:val="1F2937"/>
+          <w:sz w:val="22"/>
+          <w:szCs w:val="22"/>
+        </w:rPr>
+        <w:t xml:space="preserve">2. Éditeur de la traduction française.</w:t>
+      </w:r>
+    </w:p>
+    <w:p>
+      <w:pPr>
+        <w:spacing w:after="60" w:before="60"/>
+      </w:pPr>
+      <w:r>
+        <w:rPr>
+          <w:rFonts w:ascii="Times New Roman" w:cs="Times New Roman" w:eastAsia="Times New Roman" w:hAnsi="Times New Roman"/>
+          <w:b w:val="false"/>
+          <w:bCs w:val="false"/>
+          <w:color w:val="1F2937"/>
+          <w:sz w:val="22"/>
+          <w:szCs w:val="22"/>
+        </w:rPr>
+        <w:t xml:space="preserve">Version initiale : « La traduction française paraît chez Ariane Éditions ». L'édition française est parue aux Éditions Hélios en 1985. L'ISBN cité (978-2880630003) était, lui, exact — c'est bien celui de cette édition.</w:t>
+      </w:r>
+    </w:p>
+    <w:p>
+      <w:pPr>
+        <w:spacing w:after="60" w:before="60"/>
+      </w:pPr>
+      <w:r>
+        <w:rPr>
+          <w:rFonts w:ascii="Times New Roman" w:cs="Times New Roman" w:eastAsia="Times New Roman" w:hAnsi="Times New Roman"/>
+          <w:b w:val="false"/>
+          <w:bCs w:val="false"/>
+          <w:color w:val="1F2937"/>
+          <w:sz w:val="22"/>
+          <w:szCs w:val="22"/>
+        </w:rPr>
+        <w:t xml:space="preserve">3. Sources d'astronomie — la correction la plus importante.</w:t>
+      </w:r>
+    </w:p>
+    <w:p>
+      <w:pPr>
+        <w:spacing w:after="60" w:before="60"/>
+      </w:pPr>
+      <w:r>
+        <w:rPr>
+          <w:rFonts w:ascii="Times New Roman" w:cs="Times New Roman" w:eastAsia="Times New Roman" w:hAnsi="Times New Roman"/>
+          <w:b w:val="false"/>
+          <w:bCs w:val="false"/>
+          <w:color w:val="1F2937"/>
+          <w:sz w:val="22"/>
+          <w:szCs w:val="22"/>
+        </w:rPr>
+        <w:t xml:space="preserve">Version initiale : quatre des cinq sources du Régime A étaient des pages Wikipédia (Orbite de la Lune, Mois draconitique, Éclipse solaire, Éclipse lunaire). Le parcours impose de vérifier les données astronomiques auprès de l'IMCCE, de l'Observatoire de Paris ou de la NASA. Les valeurs chiffrées étaient exactes, mais la source censée les établir ne l'était pas. Elles ont été remplacées par la page NASA/GSFC « Eclipses and the Moon's Orbit » et par deux dossiers de l'IMCCE, tous testés le 20/08/2026 (statut 200).</w:t>
+      </w:r>
+    </w:p>
+    <w:p>
+      <w:pPr>
+        <w:spacing w:after="60" w:before="60"/>
+      </w:pPr>
+      <w:r>
+        <w:rPr>
+          <w:rFonts w:ascii="Times New Roman" w:cs="Times New Roman" w:eastAsia="Times New Roman" w:hAnsi="Times New Roman"/>
+          <w:b w:val="false"/>
+          <w:bCs w:val="false"/>
+          <w:color w:val="1F2937"/>
+          <w:sz w:val="22"/>
+          <w:szCs w:val="22"/>
+        </w:rPr>
+        <w:t xml:space="preserve">4. Précision affichée sur le cycle des nœuds.</w:t>
+      </w:r>
+    </w:p>
+    <w:p>
+      <w:pPr>
+        <w:spacing w:after="60" w:before="60"/>
+      </w:pPr>
+      <w:r>
+        <w:rPr>
+          <w:rFonts w:ascii="Times New Roman" w:cs="Times New Roman" w:eastAsia="Times New Roman" w:hAnsi="Times New Roman"/>
+          <w:b w:val="false"/>
+          <w:bCs w:val="false"/>
+          <w:color w:val="1F2937"/>
+          <w:sz w:val="22"/>
+          <w:szCs w:val="22"/>
+        </w:rPr>
+        <w:t xml:space="preserve">Version initiale : « Période complète de ce cycle : 18,5996 ans » et « à raison de 19,3549° par an ». Ces décimales venaient de l'article Wikipédia. Les deux sources de référence ne concordent pas à ce niveau de précision : la NASA donne 6 793,48 jours, l'IMCCE 18,61 années tropiques (6 797,16 jours), soit environ quatre jours d'écart. Le texte annonce désormais « environ 18,6 ans » et « environ 19,35° par an », en citant les deux valeurs. La cohérence interne du jeu de chiffres a été recalculée et se vérifie : sur 6 793,5 jours, on compte 249,65 mois draconitiques contre 248,65 mois sidéraux, soit exactement l'unité d'écart annoncée.</w:t>
+      </w:r>
+    </w:p>
+    <w:p>
+      <w:pPr>
+        <w:spacing w:after="60" w:before="60"/>
+      </w:pPr>
+      <w:r>
+        <w:rPr>
+          <w:rFonts w:ascii="Times New Roman" w:cs="Times New Roman" w:eastAsia="Times New Roman" w:hAnsi="Times New Roman"/>
+          <w:b w:val="false"/>
+          <w:bCs w:val="false"/>
+          <w:color w:val="1F2937"/>
+          <w:sz w:val="22"/>
+          <w:szCs w:val="22"/>
+        </w:rPr>
+        <w:t xml:space="preserve">5. Deux coquilles.</w:t>
+      </w:r>
+    </w:p>
+    <w:p>
+      <w:pPr>
+        <w:spacing w:after="60" w:before="60"/>
+      </w:pPr>
+      <w:r>
+        <w:rPr>
+          <w:rFonts w:ascii="Times New Roman" w:cs="Times New Roman" w:eastAsia="Times New Roman" w:hAnsi="Times New Roman"/>
+          <w:b w:val="false"/>
+          <w:bCs w:val="false"/>
+          <w:color w:val="1F2937"/>
+          <w:sz w:val="22"/>
+          <w:szCs w:val="22"/>
+        </w:rPr>
+        <w:t xml:space="preserve">« elle résonite-t-elle ? » est devenu « résonne-t-elle ? » ; « Les leçons 06 déploiera cela » est devenu « La leçon 06 déploiera cela ».</w:t>
+      </w:r>
+    </w:p>
+    <w:p>
+      <w:pPr>
+        <w:spacing w:after="60" w:before="60"/>
+      </w:pPr>
+      <w:r>
+        <w:rPr>
+          <w:rFonts w:ascii="Times New Roman" w:cs="Times New Roman" w:eastAsia="Times New Roman" w:hAnsi="Times New Roman"/>
+          <w:b w:val="false"/>
+          <w:bCs w:val="false"/>
+          <w:color w:val="1F2937"/>
+          <w:sz w:val="22"/>
+          <w:szCs w:val="22"/>
+        </w:rPr>
+        <w:t xml:space="preserve">Vérifié lors de la relecture et inchangé : l'inclinaison moyenne de 5,145° et l'opposition à 180° des deux nœuds (NASA) ; la révolution draconitique de 27,2122 jours et le mois sidéral de 27,3217 jours (IMCCE, NASA) ; l'intervalle de 173,3 jours ; Rahu et Ketu comme graha en jyotish ; Caput et Cauda Draconis dans la tradition médiévale ; et la référence de Jan Spiller, Astrology for the Soul (Bantam Books, 1997).</w:t>
+      </w:r>
+    </w:p>
     <w:sectPr>
       <w:pgSz w:w="11906" w:h="16838" w:orient="portrait"/>
       <w:pgMar w:top="1440" w:right="1440" w:bottom="1440" w:left="1440" w:header="708" w:footer="708" w:gutter="0"/>

</xml_diff>